<commit_message>
Todas las responsivas en .docx
</commit_message>
<xml_diff>
--- a/AGROCISA_core/Archivos_Responsivas/plantilla_celulares.docx
+++ b/AGROCISA_core/Archivos_Responsivas/plantilla_celulares.docx
@@ -58,7 +58,7 @@
           <w:sz w:val="20"/>
           <w:szCs w:val="20"/>
         </w:rPr>
-        <w:t xml:space="preserve">{{fecha}}</w:t>
+        <w:t xml:space="preserve">{{fecha_entrega}}</w:t>
       </w:r>
       <w:r>
         <w:rPr>
@@ -115,7 +115,7 @@
           <w:sz w:val="20"/>
           <w:szCs w:val="20"/>
         </w:rPr>
-        <w:t xml:space="preserve">{{nombre_empleado}}</w:t>
+        <w:t xml:space="preserve">{{empleado}}</w:t>
       </w:r>
       <w:r>
         <w:rPr>
@@ -798,7 +798,7 @@
                 <w:sz w:val="20"/>
                 <w:szCs w:val="20"/>
               </w:rPr>
-              <w:t xml:space="preserve">{{serie}}</w:t>
+              <w:t xml:space="preserve">{{numero_serie}}</w:t>
             </w:r>
             <w:r>
               <w:rPr>
@@ -894,7 +894,7 @@
                 <w:sz w:val="20"/>
                 <w:szCs w:val="20"/>
               </w:rPr>
-              <w:t xml:space="preserve">{{cuenta_gmail}}</w:t>
+              <w:t xml:space="preserve">{{correo_gmail}}</w:t>
             </w:r>
             <w:r>
               <w:rPr>
@@ -981,7 +981,7 @@
                 <w:sz w:val="20"/>
                 <w:szCs w:val="20"/>
               </w:rPr>
-              <w:t xml:space="preserve">{{cuenta_agrocisa}}</w:t>
+              <w:t xml:space="preserve">{{correo_corporativo}}</w:t>
             </w:r>
             <w:r>
               <w:rPr>
@@ -1068,7 +1068,7 @@
                 <w:sz w:val="20"/>
                 <w:szCs w:val="20"/>
               </w:rPr>
-              <w:t xml:space="preserve">{{gigas}} GB</w:t>
+              <w:t xml:space="preserve">{{gb}} GB</w:t>
             </w:r>
             <w:r>
               <w:rPr>
@@ -1416,7 +1416,7 @@
                 <w:sz w:val="20"/>
                 <w:szCs w:val="20"/>
               </w:rPr>
-              <w:t xml:space="preserve">{{observaciones}}</w:t>
+              <w:t xml:space="preserve">{{comentarios}}</w:t>
             </w:r>
             <w:r>
               <w:rPr>

</xml_diff>